<commit_message>
content: update L22 collaboration journal to v3
</commit_message>
<xml_diff>
--- a/public/notes/assets/l22-journal/journal.docx
+++ b/public/notes/assets/l22-journal/journal.docx
@@ -4,20 +4,106 @@
   <w:body>
     <w:p>
       <w:pPr>
-        <w:pStyle w:val="Heading1"/>
+        <w:pStyle w:val="Title"/>
+        <w:jc w:val="center"/>
       </w:pPr>
       <w:r>
-        <w:t>AI協作日誌｜從決定專攻L22，到建立陪考系統</w:t>
+        <w:rPr>
+          <w:rFonts w:ascii="Arial" w:hAnsi="Arial" w:eastAsia="PingFang TC"/>
+          <w:b/>
+          <w:color w:val="4F612F"/>
+          <w:sz w:val="50"/>
+        </w:rPr>
+        <w:t>AI協作日誌／協作手冊｜從決定專攻L22，到雙核心陪考系統</w:t>
       </w:r>
     </w:p>
     <w:p>
+      <w:pPr>
+        <w:jc w:val="center"/>
+      </w:pPr>
       <w:r>
-        <w:t>完整對話演變紀錄｜v2.0｜2026-10-18</w:t>
+        <w:rPr>
+          <w:color w:val="75582E"/>
+          <w:sz w:val="22"/>
+        </w:rPr>
+        <w:t>AI協作日誌 01｜v3.0｜2026-10-22</w:t>
       </w:r>
     </w:p>
     <w:p>
+      <w:pPr>
+        <w:jc w:val="center"/>
+      </w:pPr>
+      <w:r/>
+      <w:fldSimple w:instr="TOC \o &quot;1-2&quot; \h \z \u"/>
+    </w:p>
+    <w:p>
+      <w:pPr>
+        <w:pStyle w:val="IntenseQuote"/>
+      </w:pPr>
       <w:r>
-        <w:t>範圍：本對話起點至本次日誌修正；取代僅聚焦飲料教學的第一版。</w:t>
+        <w:rPr>
+          <w:b/>
+        </w:rPr>
+        <w:t>版本：v3.0｜更新：2026-10-22｜整理：知臨</w:t>
+      </w:r>
+    </w:p>
+    <w:p>
+      <w:pPr>
+        <w:pStyle w:val="IntenseQuote"/>
+      </w:pPr>
+      <w:r>
+        <w:t>這份正本同時保存「事情怎麼一路演變」與「現在三方要怎麼接力」。題庫原文、完整選項與詳解屬付費資料，只留本機；共同大腦保存規則、題號、進度與成果索引。</w:t>
+      </w:r>
+    </w:p>
+    <w:p>
+      <w:pPr>
+        <w:jc w:val="center"/>
+      </w:pPr>
+      <w:r>
+        <w:drawing>
+          <wp:inline xmlns:a="http://schemas.openxmlformats.org/drawingml/2006/main" xmlns:pic="http://schemas.openxmlformats.org/drawingml/2006/picture">
+            <wp:extent cx="6048000" cy="4032000"/>
+            <wp:docPr id="1" name="Picture 1"/>
+            <wp:cNvGraphicFramePr>
+              <a:graphicFrameLocks noChangeAspect="1"/>
+            </wp:cNvGraphicFramePr>
+            <a:graphic>
+              <a:graphicData uri="http://schemas.openxmlformats.org/drawingml/2006/picture">
+                <pic:pic>
+                  <pic:nvPicPr>
+                    <pic:cNvPr id="0" name="課程｜L22陪考｜雙核心陪考系統架構圖.png"/>
+                    <pic:cNvPicPr/>
+                  </pic:nvPicPr>
+                  <pic:blipFill>
+                    <a:blip r:embed="rId10"/>
+                    <a:stretch>
+                      <a:fillRect/>
+                    </a:stretch>
+                  </pic:blipFill>
+                  <pic:spPr>
+                    <a:xfrm>
+                      <a:off x="0" y="0"/>
+                      <a:ext cx="6048000" cy="4032000"/>
+                    </a:xfrm>
+                    <a:prstGeom prst="rect"/>
+                  </pic:spPr>
+                </pic:pic>
+              </a:graphicData>
+            </a:graphic>
+          </wp:inline>
+        </w:drawing>
+      </w:r>
+    </w:p>
+    <w:p>
+      <w:pPr>
+        <w:jc w:val="center"/>
+      </w:pPr>
+      <w:r>
+        <w:rPr>
+          <w:i/>
+          <w:sz w:val="18"/>
+        </w:rPr>
+        <w:t>L22雙核心陪考系統架構圖</w:t>
       </w:r>
     </w:p>
     <w:p>
@@ -25,32 +111,22 @@
         <w:pStyle w:val="Heading2"/>
       </w:pPr>
       <w:r>
-        <w:t>為什麼開始：把就服乙級延後</w:t>
+        <w:t>起點與目標：為什麼建立L22陪考系統</w:t>
       </w:r>
     </w:p>
     <w:p>
       <w:r>
-        <w:t>這段對話不是從一杯綠茶開始，而是從我決定重新分配時間開始。我把這次就服乙級延到下批，近期專心攻 L22。當時的理由很清楚：工作環境積極推動 AI 導入，我又是銀髮相關的種子人員，希望先把能力與資格準備起來，搶得先機。</w:t>
+        <w:t>為什麼開始這份L22陪考日誌？這段協作從一個取捨開始。我決定先放棄這一批就服乙級，把考試延到下一批，近期集中火力準備 L22。原因不是一時興起，而是工作環境正積極推動 AI 導入，我又是銀髮相關的種子人員，希望提早取得中級能力與證明。</w:t>
       </w:r>
     </w:p>
     <w:p>
       <w:r>
-        <w:t>我提到，機關裡拿到中級的人「搞不好不到 5 人」。這是我當時對機會的判斷，不是已查證的人數統計。重點是我看見職涯與工作應用上的時機，因此選擇集中火力，而不是同時追兩張證照。</w:t>
+        <w:t>我當時提到，機關裡拿到中級的人「搞不好不到 5 人」。這是我對現場機會的感受，並非已查證的人數統計。真正確定的決策是：這一階段先把 L22 拿下，不再讓兩張考試同時分散注意力。</w:t>
       </w:r>
     </w:p>
     <w:p>
       <w:r>
-        <w:t>接著我說，要告知 CC，問兩個 AI 怎麼派工陪我應考，並決定從現在開始天天刷題。我的期待已經超過臨時問幾道題：我要一組能共同規劃、執行、覆核與追蹤的學習夥伴。</w:t>
-      </w:r>
-    </w:p>
-    <w:p>
-      <w:r>
-        <w:t>這份日誌保存的範圍，是本對話從備考取捨、90 分目標、期限與分工，到刷題、圖卡、教學修正，最後連日誌本身也被我要求重寫的整個演變。章節依對話先後與因果整理，不替沒有時間戳的發言杜撰日期。</w:t>
-      </w:r>
-    </w:p>
-    <w:p>
-      <w:r>
-        <w:t>角色：Tarshar 決定方向與節奏；知臨執行教學和交付；CC／Claude 參與獨立覆核。付費題庫原文不收進本日誌；工作背景只保留理解動機所需的程度。</w:t>
+        <w:t>接著我要求 Codex 與 CC 一起陪考，從每天刷題開始。這使任務從一次問答，逐步長成一套能出題、教學、記錄、製卡、回測與每日結算的陪考系統。</w:t>
       </w:r>
     </w:p>
     <w:p>
@@ -58,32 +134,22 @@
         <w:pStyle w:val="Heading2"/>
       </w:pPr>
       <w:r>
-        <w:t>目標：從一定要拿下，到 90 分以上</w:t>
+        <w:t>成功標準：不是只求通過，而是90分以上</w:t>
       </w:r>
     </w:p>
     <w:p>
       <w:r>
-        <w:t>我先表達這次一定要拿下，隨後把標準說得更明確：「我目標 90 分以上。」這不是只求通過的讀書計畫。AI 必須考慮全範圍、容易混淆的觀念、答題穩定度，而不是每天幾題做完就算有進度。</w:t>
+        <w:t>我把目標定為 90 分以上，並要求所有複習與達標能力在 11 月 7 日前完成，保留最後一週衝刺。執行正本將 11 月 6 日設為能力準備截止，11 月 7 日進行總驗收，11 月 8日至13日只做錯題、易混觀念、速度與穩定度加強。</w:t>
       </w:r>
     </w:p>
     <w:p>
       <w:r>
-        <w:t>後來，我說昨天沒有完整跟到討論，請 AI 從頭重新對焦。我要知道到底怎麼規劃，而不是接收零散指令。交付除了文字，還要有一目了然的架構圖，而且圖必須能下載。這是後來視覺交付規則的起點，當時還不只是知識圖卡。</w:t>
+        <w:t>我最初口述 11 月 15 日應考；既有官方查核紀錄標示 11 月 14 日。本日誌保留這個差異，最終仍以准考通知為準，不把後來查到的日期改寫成「一開始就知道」。</w:t>
       </w:r>
     </w:p>
     <w:p>
       <w:r>
-        <w:t>期限也由我再往前拉：所有複習與達到 90 分以上的能力，要在 11 月 7 日前完成，留一週最後衝刺。執行紀錄因此把主要檢核截止設在 11 月 6 日，11 月 7 日驗收並啟動最後複習週。</w:t>
-      </w:r>
-    </w:p>
-    <w:p>
-      <w:r>
-        <w:t>我最初口述考日是 11 月 15 日；既有官方查核紀錄記為 11 月 14 日。這份日誌保留兩者的差異，個人應試仍需核對通知，不能把我最初說的日期悄悄改成「一開始就正確」。</w:t>
-      </w:r>
-    </w:p>
-    <w:p>
-      <w:r>
-        <w:t>AI 提出的備妥參考，是近期連續三場具範圍覆蓋、未見題為主的限時混合卷達 90%以上，配合弱點回測。這屬教練檢核方案，不是實考分數保證；後來一週刷完全庫，又帶來未見題是否足夠的新問題。</w:t>
+        <w:t>90 分能力不能用做了幾張圖卡或看完多少說明代替。現行檢核參考是：全範圍已複習、弱點完成延遲回測，並在近期具範圍覆蓋的限時混合卷連續三次達到 90%以上。</w:t>
       </w:r>
     </w:p>
     <w:p>
@@ -91,37 +157,22 @@
         <w:pStyle w:val="Heading2"/>
       </w:pPr>
       <w:r>
-        <w:t>分工：兩個 AI，要交同一份作業</w:t>
+        <w:t>從計畫表到可視化：我要一眼看懂</w:t>
       </w:r>
     </w:p>
     <w:p>
       <w:r>
-        <w:t>我問「你們倆怎麼派工」，是希望 Codex 與 CC 互相補位，而不是同一件事講兩遍，或各自出一份作業讓我整合。</w:t>
+        <w:t>我沒有完整跟到前一輪討論，所以要求全部重新對焦。除了文字，我還要一張可下載的架構圖；進度表要列出每段大綱與檢核點，完成可以打勾，提前完成也看得出來。</w:t>
       </w:r>
     </w:p>
     <w:p>
       <w:r>
-        <w:t>當時留下的分工是：知臨在本對話擔任主教練，負責出題、即時批改、錯題與進度紀錄，以及安排覆核。CC／茜茜負責獨立檢查題幹與解析、協助生活化說明，並在週檢時依實際成績檢視策略。我只收到整合後的一份學習安排。</w:t>
+        <w:t>這個要求建立了兩條分開的證據線：教材與系統有沒有做好，以及我有沒有真的學會。看過、作答、答對、理解、延遲回測通過，是不同狀態；不能為了讓表格好看就提早打勾。</w:t>
       </w:r>
     </w:p>
     <w:p>
       <w:r>
-        <w:t>既有協作紀錄顯示，CC 已收到備考決策，並檢視過首輪提供的題目文字；新期限提出後，也建議增加正式檢核機會。排程因此預留四場檢核，仍以最近連續三場達標作參考。</w:t>
-      </w:r>
-    </w:p>
-    <w:p>
-      <w:r>
-        <w:t>但覆核範圍必須說清楚：上述 CC 工作依當時提供的文字完成，不等於讀過全部原始題庫、圖卡或這份日誌。不能把「有叫另一個 AI 看過」擴張成全部成果都經獨立審查。</w:t>
-      </w:r>
-    </w:p>
-    <w:p>
-      <w:r>
-        <w:t>形成的規則：共同紀錄要能讓兩個 AI 接續；每次覆核應留下看了什麼、發現什麼、採納什麼和未檢查什麼。AI 的分工是替我減少管理工作，不是把協調責任推回給我。</w:t>
-      </w:r>
-    </w:p>
-    <w:p>
-      <w:r>
-        <w:t>狀態：分工已建立；本次新版日誌未另宣稱 CC 已審閱。</w:t>
+        <w:t>13 個單元的進度、題號覆蓋、錯題與回測日期，後來集中進唯一進度資料。每天結算必須同時呈現目標、實際、剩餘、正確率與需加強項目。</w:t>
       </w:r>
     </w:p>
     <w:p>
@@ -129,32 +180,22 @@
         <w:pStyle w:val="Heading2"/>
       </w:pPr>
       <w:r>
-        <w:t>進度：我要看見打勾，也要看見提前</w:t>
+        <w:t>既有資產與需求：從「約460題」核對為650題</w:t>
       </w:r>
     </w:p>
     <w:p>
       <w:r>
-        <w:t>我接著要求，把每段的大綱與檢核點全部列出來。我打算加快進度，因此每天的表要看得出哪些完成、哪些提前完成。這不是只要一張漂亮時間表，而是要能感受到自己真的往前走。</w:t>
+        <w:t>我提醒 AI，原本就有 L22 終極題庫，不應該另外長題目。核對本機後，HTML 小站共有 13 章，每章 50 題，合計 650 個唯一題號。既有核稿分為 453 題未見明顯問題、142 題有歧義或過度簡化、53 題需修正、2 題待查證。</w:t>
       </w:r>
     </w:p>
     <w:p>
       <w:r>
-        <w:t>AI 把內容拆成 13 個單元，涵蓋統計、資料整理與儲存、分析與視覺化、機器學習及安全等範圍；安排診斷、首輪複習、限時檢核、CC 驗收與最後衝刺。每項需要原訂日期、實際日期和完成依據。</w:t>
+        <w:t>453 是否就是我記得「約 460 題」的來源，沒有直接證據，不能代我下結論。可以確定的是：後續正式測驗只能使用這 650 題，保留原題幹、A～D 選項、順序、章節與原題號；出題前要交叉核對原始 JSON、來源 HTML 與核稿紀錄。</w:t>
       </w:r>
     </w:p>
     <w:p>
       <w:r>
-        <w:t>最初安排每日少量三題一輪，再依速度增加，首輪規劃到 10 月 29 日。但我後來明確要求一週刷完整個題庫，首輪題庫覆蓋目標因此改為 10 月 18 至 24 日。舊表留下的是演變歷史，不能和新目標同時當成現行指令。</w:t>
-      </w:r>
-    </w:p>
-    <w:p>
-      <w:r>
-        <w:t>我希望打勾有感，AI 就更不能亂勾。看過說明、已做圖卡、已作答、答對、隔天仍記得，是不同狀態。提前完成也要依原訂日期比較，不能事後改基準日期製造漂亮進度。</w:t>
-      </w:r>
-    </w:p>
-    <w:p>
-      <w:r>
-        <w:t>形成的規則：每日結算同時列出目標、實際完成、剩餘與需加強。進度慢就照實呈現差距，不以教材產出代替我的學習成果。90 分能力必須另有作答證據。</w:t>
+        <w:t>先前的自編暖身題可保留為學習歷史，但不計入 650 題覆蓋。題庫本身若有爭議，先標為待查核，也不能把來源問題算成我的錯。</w:t>
       </w:r>
     </w:p>
     <w:p>
@@ -162,32 +203,22 @@
         <w:pStyle w:val="Heading2"/>
       </w:pPr>
       <w:r>
-        <w:t>題庫：我提醒，原本就有 HTML 小站</w:t>
+        <w:t>介面取捨：取消互動網頁，保留視覺學習</w:t>
       </w:r>
     </w:p>
     <w:p>
       <w:r>
-        <w:t>當 AI 在規劃刷題時，我提醒：「你不是有我 L22 終極的考題可以刷題嗎？我記得有 460 題之類的。」這一問把問題拉回既有資產：不是沒有題目，而是 AI 沒有先把原本的題庫接上。</w:t>
+        <w:t>我一開始希望做互動式練習網頁，可以直接點選答案，畫面有儀式感。但實際等候與操作成本太高，我後來明確取消，改回在對話中直接作答。</w:t>
       </w:r>
     </w:p>
     <w:p>
       <w:r>
-        <w:t>本機核對後，原始分章題庫有 13 章、每章 50 題，合計 650 個唯一題號。既有核稿資料中，453 題未見明顯問題，142 題有歧義或過度簡化，53 題需修正，2 題待查證。453 是否就是我印象中約 460 的來源，沒有確認，不能代我下結論。</w:t>
+        <w:t>取消的是練習網站，不是視覺學習。我仍要求需要圖解的地方直接帶出圖，文字說明與可下載圖片要同時存在。題目維持清楚的選擇題格式，每題各自列 A～D，不能變成問答題或共用選項。</w:t>
       </w:r>
     </w:p>
     <w:p>
       <w:r>
-        <w:t>後續 AI 仍曾使用自編暖身題，這與我的期待不一致。我因此把限制講清楚：現在給我的題目，全部都要來自 HTML 小站，不能自己長題目。原題幹、選項與順序要能回到來源查核。</w:t>
-      </w:r>
-    </w:p>
-    <w:p>
-      <w:r>
-        <w:t>這項修正也改變統計方式：先前自編題可以保留學習紀錄，但不能算進 650 題完成數；官方舊題也不能直接混在這個分母裡。題庫本身有疑點時，先查核，不把來源問題算成我的錯。</w:t>
-      </w:r>
-    </w:p>
-    <w:p>
-      <w:r>
-        <w:t>形成的規則：每題都要有原始題號，來源、是否已曝光、是否作答與是否批改分開。付費原題與詳解依既有限制留本機，共同腦保存進度與索引，自製教學例子不冒充考題。</w:t>
+        <w:t>另一條節奏規則也在這裡確立：每批結束必須停下，只有我明確說「開始考試」或「繼續作答」才出下一批。停下時要說清楚目前完成到哪裡、後面還有什麼，不可無故中斷，也不可自動往下跑。</w:t>
       </w:r>
     </w:p>
     <w:p>
@@ -195,32 +226,22 @@
         <w:pStyle w:val="Heading2"/>
       </w:pPr>
       <w:r>
-        <w:t>練習介面：先求互動，後來選擇直接答</w:t>
+        <w:t>教學校準：不懂就留在原地換一個說法</w:t>
       </w:r>
     </w:p>
     <w:p>
       <w:r>
-        <w:t>我一開始希望直接點選答案，畫面互動、可視化，做題比較有儀式感。但等待與操作成本讓我改變主意：「互動式的練習網頁先取消吧」，直接在這裡一問一答比較快。</w:t>
+        <w:t>ACID 是第一個明確的「沒讀過」。我要求只要說沒讀過、常搞混、答錯、打問號，或雖然答對卻問為什麼，就要從零說明並記錄；英文術語在對話中可加一個中文近似唸法，幫助我建立聲音記憶。</w:t>
       </w:r>
     </w:p>
     <w:p>
       <w:r>
-        <w:t>這是需求演變中的明確取捨。不能因為我曾經想要互動網頁，就繼續把資源投在網站；也不能把取消網頁理解成我不再需要圖。我之後仍強調，能幫助記憶的內容要把圖帶出來。</w:t>
+        <w:t>我指定要像李宏毅教授那樣有趣、淺顯：先用具體情境與動作，再把它轉成數字或規則，最後才放正式名詞。AI 曾用「每個類別各有一盞燈」解釋 One-Hot，我覺得更難懂；換成飲料店「選綠茶就是 0、1、0」後，我才表示理解。</w:t>
       </w:r>
     </w:p>
     <w:p>
       <w:r>
-        <w:t>取消網頁後，我直接回答前三題：第一題選 D，並註明沒讀過，另外兩題選 A、B。這組後來被記為自編暖身題，1／3 正確，與正式題庫進度分開。第一題即使答對，「沒讀過」仍然是需要教學的訊號。</w:t>
-      </w:r>
-    </w:p>
-    <w:p>
-      <w:r>
-        <w:t>之後我又指出，選擇題怎麼變成問答題。AI 的呈現方式沒有維持我預期的逐題選項格式。修正後，每題應個別列出 A～D，避免共享選項或文字敘述讓答題介面變得不清楚。</w:t>
-      </w:r>
-    </w:p>
-    <w:p>
-      <w:r>
-        <w:t>另一項界線是流程不能無故停住。我說，若需要停下，後面還有什麼要我確定，應該講清楚。這不等於可以自動一直出題；它要求的是明確回報完成到哪裡、下一步依賴什麼。</w:t>
+        <w:t>後來我追問 1,000 杯飲料如何統計，AI 一度沿著編碼繼續講。我再把問題拉回目的：若要知道各品項賣幾杯，應使用分組計數與次數表；只有要把品項餵給模型時，才談編碼。這形成固定教學順序：先辨認我想完成什麼，再決定要教哪個術語。</w:t>
       </w:r>
     </w:p>
     <w:p>
@@ -228,32 +249,32 @@
         <w:pStyle w:val="Heading2"/>
       </w:pPr>
       <w:r>
-        <w:t>「沒讀過」：從批改，走向補課與記憶</w:t>
+        <w:t>知識圖卡：不會的觀念逐題做，但必須先理解</w:t>
       </w:r>
     </w:p>
     <w:p>
       <w:r>
-        <w:t>ACID 是第一個明確浮出的知識缺口。我說沒讀過，就要求詳細說明並記錄，之後透過七天學習記憶的方式，不斷提醒這個內容。我的需求不是看一眼答案就結束，而是讓陌生概念回到複習流程。</w:t>
+        <w:t>我提供喜歡的公仔風格，建立「Tarshar陪你學L22 🍀」系列。每張最多出現一個我的公仔；若內容需要更多角色，改用可愛 AI 機器人。每張要換色系、排版與表情動作，可用直式、橫式或四區塊，維持同系列辨識，同時避免只換文字。</w:t>
       </w:r>
     </w:p>
     <w:p>
       <w:r>
-        <w:t>後來回答第 4、5、6 題時，我又說第 6 題的四種方式都沒讀過，尤其英文完全對應不到。這揭露另一種困難：不是只有公式不熟，連名稱與用途都還沒連起來。</w:t>
+        <w:t>我也糾正過署名仍寫「芝琳」、風格沒改對，以及私人中文諧音被印到分享圖卡的問題。現在的分享版只保留正式中英文，不放括號中文唸法；私人唸法只在對話出現。</w:t>
       </w:r>
     </w:p>
     <w:p>
       <w:r>
-        <w:t>教學因此需要把 ACID、偏態、Min-Max、Z-score、Robust 與 One-Hot 等概念拆開，用中文用途、生活例子和圖像建立對應。它們不能只擠在一張比較表裡，就假定我已經理解差異。</w:t>
+        <w:t xml:space="preserve">原規則是每解答一題我不會的就做一張。後來為了避免「講過但我仍不懂」也被製成錯誤記憶，流程補上理解閘門：CC 講完後先等我確認懂了；只有 </w:t>
       </w:r>
-    </w:p>
-    <w:p>
       <w:r>
-        <w:t>圖卡與記憶流程從這裡長出來：我說沒讀過，就要從零解說、建立圖卡，並安排後續回顧。後來執行紀錄整理成第 1、3、7 天回顧，但排了日期不代表已經複習，更不代表記住了。</w:t>
+        <w:rPr>
+          <w:rFonts w:ascii="Menlo" w:hAnsi="Menlo"/>
+          <w:color w:val="75582E"/>
+        </w:rPr>
+        <w:t>understanding_status=understood</w:t>
       </w:r>
-    </w:p>
-    <w:p>
       <w:r>
-        <w:t>形成的規則：學習狀態不能只看選項對錯。答錯、沒讀過、常搞混、猜對或答對但問為什麼，都需要追蹤；沒有選答案則記未答，不自動算錯。</w:t>
+        <w:t xml:space="preserve"> 且需要製卡，Codex 才製作、檢查、上傳與建立 1／3／7 天回測。</w:t>
       </w:r>
     </w:p>
     <w:p>
@@ -261,32 +282,22 @@
         <w:pStyle w:val="Heading2"/>
       </w:pPr>
       <w:r>
-        <w:t>圖卡品牌：從參考圖到自己的學習系列</w:t>
+        <w:t>建造歷程：3題、5題，最後固定10題</w:t>
       </w:r>
     </w:p>
     <w:p>
       <w:r>
-        <w:t>我提供了一張喜歡的公仔風格參考，指定使用「Tarshar陪你學L22 🍀」。這一步把知識圖卡從臨時補充，變成我希望持續累積、也能分享的視覺學習系列。</w:t>
+        <w:t>最初採三題一輪，後來我要求一次五題，再因進度太慢改成一次十題。現在每批固定十題，交卷後立刻列出我的答案、原題正解與逐題對錯；接著處理所有錯題、未答、不確定與追問題。</w:t>
       </w:r>
     </w:p>
     <w:p>
       <w:r>
-        <w:t>接著我補上限制：一張圖裡我的公仔最多一個，若內容還需要人物，改用可愛 AI 機器人。我不喜歡到處重複自己的形象，因為畫面會太花。這不是不要人物，而是希望主次清楚。</w:t>
+        <w:t>我曾要求把錯題留到整批結束再教，後來又修正為「每十題對完答案就說明」，避免拖太久忘記當時怎麼想。現行規則以後者為準：一批十題，對完立即教，理解確認後才結束這批。</w:t>
       </w:r>
     </w:p>
     <w:p>
       <w:r>
-        <w:t>我也要求，之後提到沒讀過就主動說明、製圖，並存進雲端的知識圖卡資料夾。口述資料夾名稱與實際既有名稱不同，執行時已對到 iPas準備／中級／知識圖卡，應以實際位置交付連結。</w:t>
-      </w:r>
-    </w:p>
-    <w:p>
-      <w:r>
-        <w:t>過程中，我指出存進去的圖仍有一張寫著「芝琳」，風格也沒有改對，要求重做後放回去。這顯示完成不能只驗「有圖片」或「上傳成功」，還必須核對人名、品牌與視覺要求。</w:t>
-      </w:r>
-    </w:p>
-    <w:p>
-      <w:r>
-        <w:t>我進一步要求每張換色系，公仔表情動作也要不同；版面可直式、橫式或四區塊。不能只換文字，打開每張卻像同一張。形成的規則是：內容正確與系列一致之外，每張還要有足夠辨識度。</w:t>
+        <w:t>未選、只寫「？」或「完全不懂」記為未作答，不計錯也不計首輪完成；答錯則算已作答與首輪覆蓋。理解說明與延遲回測仍要分開，當下懂不代表隔天還記得。</w:t>
       </w:r>
     </w:p>
     <w:p>
@@ -294,32 +305,22 @@
         <w:pStyle w:val="Heading2"/>
       </w:pPr>
       <w:r>
-        <w:t>交付責任：為什麼我總要提醒少了哪張</w:t>
+        <w:t>題庫實體化：650題成為可列印A4 Word</w:t>
       </w:r>
     </w:p>
     <w:p>
       <w:r>
-        <w:t>我先問目前有哪些該做的圖卡，要求缺的補齊一起看；看過後肯定風格，請 AI 之後邊複習邊製作，也記得存進去。這已經是持續執行的授權，不需要每次再等我叫做圖。</w:t>
+        <w:t>我請 CC 把 HTML 小站完整題庫整理成 Word，並要求依序標示章節、每題都有答案，方便日後列印 A4。這項成果已完成為 650 題、146 頁的可編輯 Word，並逐題驗證題號與答案欄位。</w:t>
       </w:r>
     </w:p>
     <w:p>
       <w:r>
-        <w:t>但後來我仍得問：「這一批只有做這一張嗎？」甚至直接指出：「你每解答一題我不會的，不是就會做一張嗎？」問題不只是漏一張圖，而是 AI 把逐題需求誤記成整批交一張，讓我變成追蹤交付的人。</w:t>
+        <w:t>這份 Word 是私有學習材料，檔案留本機與私人雲端，不把付費題文放進 GitHub。共同大腦只保留數量、驗證狀態與位置索引。</w:t>
       </w:r>
     </w:p>
     <w:p>
       <w:r>
-        <w:t>修正後，每個不懂的題目或獨立追問，都要有明確對應的教學與圖卡。不能用全庫有幾張圖掩蓋某題漏做；也不能把我已經拒絕、仍看不懂的舊比喻當成交付完成。</w:t>
-      </w:r>
-    </w:p>
-    <w:p>
-      <w:r>
-        <w:t>我曾要求英文附中文近似唸法，方便自己記憶。AI 卻把這些私人小抄印到要分享的卡片上。我再次修正：對話可以有，圖卡不要有括號中文諧音。分享版保留正式中英文即可。</w:t>
-      </w:r>
-    </w:p>
-    <w:p>
-      <w:r>
-        <w:t>形成的交付檢核是：題目盲點對應、內容與數字正確、最多一個公仔、色系排版有差異、署名正確、沒有諧音、雲端讀回成功，最後給我可見圖與下載連結。完成這些，才是做完圖卡；仍不等於我已學會。</w:t>
+        <w:t>這一步解決「答案在哪裡」與手機上傳 0 B 的問題，也讓完整題庫不再依賴網頁介面才能查看。</w:t>
       </w:r>
     </w:p>
     <w:p>
@@ -327,32 +328,22 @@
         <w:pStyle w:val="Heading2"/>
       </w:pPr>
       <w:r>
-        <w:t>教學節奏：我還不懂，就先別往下</w:t>
+        <w:t>分工改版：CC主持測驗，知臨負責彙整與圖卡</w:t>
       </w:r>
     </w:p>
     <w:p>
       <w:r>
-        <w:t>我要求每天統計題庫總數、做過哪些題，並想一週內全部刷過。這是加速的要求，但不代表可以犧牲理解。後來我明確說，只有我說「繼續作答」，才給後面的三題。</w:t>
+        <w:t>最早的分工是知臨主教練、CC 覆核；實際操作後，我決定改在 CC 做題。現行分工已反轉並固定：CC 負責讀原始 650 題、每批出十題、批改、立即講解並確認我是否理解；Codex／知臨不再與 CC 重複出題。</w:t>
       </w:r>
     </w:p>
     <w:p>
       <w:r>
-        <w:t>因為 AI 曾在解說後直接往下一組走，我必須把這條界線說出來：若我仍看不懂，就留在這裡。我喜歡李宏毅教授那種有趣、淺顯的說明方式，不想看完一堆術語還不知道在說什麼。</w:t>
+        <w:t>知臨負責接收每批交班、核對題號與來源、更新唯一進度、逐題 CSV、錯題、每日結算與回測佇列；等我確認理解後，再製作需要的知識圖卡並上傳雲端。</w:t>
       </w:r>
     </w:p>
     <w:p>
       <w:r>
-        <w:t>AI 連教授名字都曾寫錯成李弘毅，卻表現得像已經理解我的期待。我當場質疑。修正不只是改一個字，而是不能靠熟悉的語氣假裝查證；自製比喻也不能說成教授原話。</w:t>
-      </w:r>
-    </w:p>
-    <w:p>
-      <w:r>
-        <w:t>「每個類別各有一盞燈」這個說法沒有幫到我。後來換成飲料店，依紅茶、綠茶、奶茶的順序，我選綠茶：先看沒選、有選、沒選，再轉成 0、1、0，最後才說正式名稱是獨熱編碼。我表示懂了，要求後續照這個模式。</w:t>
-      </w:r>
-    </w:p>
-    <w:p>
-      <w:r>
-        <w:t>飲料例子在整段歷程裡的意義，是找到一種我能理解的教學順序：具體場景、實際動作、數字表示、正式名稱。它是一次重要的教學轉折，卻不是整個備考協作的起點或全部。</w:t>
+        <w:t>我只需要在 CC 的可見對話室作答與確認理解，不必把答案再複製給知臨。三方分工的重點是減少我的協調工作，不是把兩套紀錄丟給我自己整合。</w:t>
       </w:r>
     </w:p>
     <w:p>
@@ -360,32 +351,22 @@
         <w:pStyle w:val="Heading2"/>
       </w:pPr>
       <w:r>
-        <w:t>再追問：先回答我要做什麼</w:t>
+        <w:t>可見性修正：CC的工作必須讓我看得到</w:t>
       </w:r>
     </w:p>
     <w:p>
       <w:r>
-        <w:t>當我問 1,000 杯飲料要做統計，應該用哪種方式，AI 一度沿著編碼與稀疏儲存往下講。我只好再澄清：我的問題是這種統計情境，不是編碼本身怎麼存。</w:t>
+        <w:t>一開始雖然 AI 說已派工給 CC，我卻在 Web 上看不到對話。真正的問題是工作落在另一個工作階段，而不是一個我能直接進入、繼續作答的可見測驗室。</w:t>
       </w:r>
     </w:p>
     <w:p>
       <w:r>
-        <w:t>回答應先區分目的。若想知道各品項賣幾杯，就依品項分組計數，做次數表或長條圖；若要把品項類別當成模型輸入，才討論編碼。1,000 杯是紀錄數，也不等於 1,000 種品項。</w:t>
+        <w:t>後來建立固定對話室「課程｜L22測驗陪跑｜CC」，放在 Claude Code 的工作階段中，並釘選到側欄上方。舊三批測驗與教學歷史保留在同一處，避免每次重新說明規則。</w:t>
       </w:r>
     </w:p>
     <w:p>
       <w:r>
-        <w:t>這和前面「有沒有看懂」是同一條主線的延伸：助教不只要說得簡單，還要抓對我正在問的問題。介紹更多技術，不能替代回答我的實際目的。</w:t>
-      </w:r>
-    </w:p>
-    <w:p>
-      <w:r>
-        <w:t>我後來問這批是否會自己做圖卡，仍需要提醒前面也有不會的題。這讓交付責任再次回到前面的規則：回看整輪未完成項，而不是只處理最後一句話。</w:t>
-      </w:r>
-    </w:p>
-    <w:p>
-      <w:r>
-        <w:t>AI 判讀：這個錯誤可重用的教訓，是不要被最近出現的術語牽走。先用一句話辨認使用者要統計、預測、儲存還是理解概念，再選解說方向。這是從本案例歸納的工作規則，不是已證明普遍有效的研究結論。</w:t>
+        <w:t>這個修正形成一項跨 AI 原則：派工完成不等於使用者看得到。涉及持續互動的工作，必須提供固定入口、可見標題與可接續歷史；否則只是 AI 內部完成，還不算真正交付。</w:t>
       </w:r>
     </w:p>
     <w:p>
@@ -393,37 +374,22 @@
         <w:pStyle w:val="Heading2"/>
       </w:pPr>
       <w:r>
-        <w:t>最後的偏航：連日誌都只抓了眼前</w:t>
+        <w:t>交接機制：CC寫JSON，知臨更新共同正本</w:t>
       </w:r>
     </w:p>
     <w:p>
       <w:r>
-        <w:t>當我請 AI 找 Skill，做 AI 協作日誌與 FB 貼文時，期待的是把這整段問題的起點與演變留下來。AI 卻把最近的飲料例子當成主題，交出〈從一杯綠茶，校準 AI 教學〉。</w:t>
+        <w:t>兩個 AI 不直接改同一份進度檔。CC 每批結束後只寫一份精簡 JSON，內容包含題號、作答字母、正解、判定、我的原話、是否需教學、理解狀態、是否需圖卡與核稿狀態，不複製付費題幹與完整解析。</w:t>
       </w:r>
     </w:p>
     <w:p>
       <w:r>
-        <w:t>那版雖然提到考試目標，主軸卻偏向眼前的教學修正。最初為什麼延後另一張證照、為什麼要求雙 AI 分工、如何拉高標準與加快進度，以及視覺與記憶規則如何一步步形成，都沒有得到相稱的篇幅與因果說明。</w:t>
+        <w:t>知臨讀取 JSON 後，先與原始題庫和核稿紀錄核對，再更新 GitHub 共同正本中的唯一進度、每日結算、逐題 CSV、錯題與圖卡索引。處理完成的 JSON 從「待彙整」移到「已彙整」，避免重複計算。</w:t>
       </w:r>
     </w:p>
     <w:p>
       <w:r>
-        <w:t>我因此指出：不是只做今天眼前看到的內容，要從這個問題開始到它的演變，整個流程記下來。這不是多加幾個前情段落就能解決，而是要重新選主題、重排章節、重寫貼文。</w:t>
-      </w:r>
-    </w:p>
-    <w:p>
-      <w:r>
-        <w:t>AI 根因判讀：最近的具體案例比較容易寫成故事，於是它取代了真正的主線。檔案有 Word、PDF、封面，也通過格式檢查，卻沒有完成範圍檢查。交付齊全不代表內容完整。</w:t>
-      </w:r>
-    </w:p>
-    <w:p>
-      <w:r>
-        <w:t>本版因此改為完整對話演變紀錄。第一版保留歷史並標示被取代，雲端沿用原連結更新；新的驗收先看是否涵蓋起點、每個改變方向的轉折與現行狀態，再看版面。</w:t>
-      </w:r>
-    </w:p>
-    <w:p>
-      <w:r>
-        <w:t>跨任務規則：做協作日誌前，先列完整對話的演變骨架；沒有核對前文，不可直接以最近一題或單日成果命名整份日誌。</w:t>
+        <w:t>這個流程把出題權、寫入權與製卡權分開，降低兩邊互相覆寫的風險。交班檔只是一批資料，GitHub 中的進度正本才是兩個 AI 下一次工作都要先讀的狀態。</w:t>
       </w:r>
     </w:p>
     <w:p>
@@ -431,24 +397,73 @@
         <w:pStyle w:val="Heading2"/>
       </w:pPr>
       <w:r>
-        <w:t>決策帳：現在採用什麼，什麼已取消</w:t>
+        <w:t>每日追蹤：提醒、彙整與誠實差距</w:t>
+      </w:r>
+    </w:p>
+    <w:p>
+      <w:r>
+        <w:t>系統現有三種節奏：每 15 分鐘檢查是否出現新的 CC 交班檔；每天 07:00 提醒當日學習與回測；每天 21:00產生進度結算。自動化只做檢查與回報，不會自行出題。</w:t>
+      </w:r>
+    </w:p>
+    <w:p>
+      <w:r>
+        <w:t>每日結算固定包含：今日新作答、答對、答錯、未答、正確率、累計覆蓋、距離當日目標與累計目標的差距、待複習觀念及下一個行動。進度慢要照實呈現，不能用圖卡數或已講解數填補題目覆蓋。</w:t>
+      </w:r>
+    </w:p>
+    <w:p>
+      <w:r>
+        <w:t>10 月 21 日當天新作答 21 題，17 對、4 錯；當日目標 93 題，差 72 題。累計目標 372 題，實際 46 題，差 326 題。這些差距代表原定七日刷完全庫已大幅落後，需要重新配置每日題量，但不能補登不存在的作答。</w:t>
+      </w:r>
+    </w:p>
+    <w:p>
+      <w:pPr>
+        <w:pStyle w:val="Heading2"/>
+      </w:pPr>
+      <w:r>
+        <w:t>系統設計與資料流程：一條學習線，兩種成果庫</w:t>
+      </w:r>
+    </w:p>
+    <w:p>
+      <w:r>
+        <w:t>學習線從 Tarshar 的明確指令開始：我說「開始考試」或「繼續作答」，CC 才從原庫出十題；我交卷後，CC 批改與講解；我確認理解後，CC 寫交班 JSON；知臨核對、彙整、製卡與排回測。</w:t>
+      </w:r>
+    </w:p>
+    <w:p>
+      <w:r>
+        <w:t>成果分為兩個位置。GitHub 共同大腦保存安全的文字正本、進度、題號、規則與索引，供 Codex 與 CC 接力；Google Drive 保存較大的知識圖卡、Word、PDF、HTML 與可下載成品。付費題文與完整詳解只留本機或私人雲端。</w:t>
+      </w:r>
+    </w:p>
+    <w:p>
+      <w:r>
+        <w:t>架構圖把這條資料流畫成可下載 PNG，並標出三個閘門：只有明確口令才出題、只有確認理解才製卡、只有核對來源才更新進度。</w:t>
+      </w:r>
+    </w:p>
+    <w:p>
+      <w:pPr>
+        <w:pStyle w:val="Heading2"/>
+      </w:pPr>
+      <w:r>
+        <w:t>目前進度儀表板：截至2026-10-21</w:t>
       </w:r>
     </w:p>
     <w:tbl>
       <w:tblPr>
-        <w:tblStyle w:val="LightGrid-Accent1"/>
+        <w:tblStyle w:val="TableGrid"/>
         <w:tblW w:type="auto" w:w="0"/>
+        <w:jc w:val="center"/>
         <w:tblLook w:firstColumn="1" w:firstRow="1" w:lastColumn="0" w:lastRow="0" w:noHBand="0" w:noVBand="1" w:val="04A0"/>
       </w:tblPr>
       <w:tblGrid>
-        <w:gridCol w:w="2880"/>
-        <w:gridCol w:w="2880"/>
-        <w:gridCol w:w="2880"/>
+        <w:gridCol w:w="3213"/>
+        <w:gridCol w:w="3213"/>
+        <w:gridCol w:w="3213"/>
       </w:tblGrid>
       <w:tr>
         <w:tc>
           <w:tcPr>
-            <w:tcW w:type="dxa" w:w="2880"/>
+            <w:tcW w:type="dxa" w:w="3213"/>
+            <w:vAlign w:val="center"/>
+            <w:shd w:fill="CBD7AB"/>
           </w:tcPr>
           <w:p>
             <w:r>
@@ -460,13 +475,15 @@
               <w:rPr>
                 <w:b/>
               </w:rPr>
-              <w:t>決定與狀態</w:t>
+              <w:t>指標</w:t>
             </w:r>
           </w:p>
         </w:tc>
         <w:tc>
           <w:tcPr>
-            <w:tcW w:type="dxa" w:w="2880"/>
+            <w:tcW w:type="dxa" w:w="3213"/>
+            <w:vAlign w:val="center"/>
+            <w:shd w:fill="CBD7AB"/>
           </w:tcPr>
           <w:p>
             <w:r>
@@ -478,13 +495,15 @@
               <w:rPr>
                 <w:b/>
               </w:rPr>
-              <w:t>理由、未採用路線</w:t>
+              <w:t>目前狀態</w:t>
             </w:r>
           </w:p>
         </w:tc>
         <w:tc>
           <w:tcPr>
-            <w:tcW w:type="dxa" w:w="2880"/>
+            <w:tcW w:type="dxa" w:w="3213"/>
+            <w:vAlign w:val="center"/>
+            <w:shd w:fill="CBD7AB"/>
           </w:tcPr>
           <w:p>
             <w:r>
@@ -496,7 +515,7 @@
               <w:rPr>
                 <w:b/>
               </w:rPr>
-              <w:t>重開條件</w:t>
+              <w:t>怎麼解讀</w:t>
             </w:r>
           </w:p>
         </w:tc>
@@ -504,34 +523,40 @@
       <w:tr>
         <w:tc>
           <w:tcPr>
-            <w:tcW w:type="dxa" w:w="2880"/>
+            <w:tcW w:type="dxa" w:w="3213"/>
+            <w:vAlign w:val="center"/>
+            <w:shd w:fill="FFFDF5"/>
           </w:tcPr>
           <w:p>
             <w:r/>
             <w:r>
-              <w:t>已確認：乙級延後，集中 L22</w:t>
+              <w:t>題庫總數</w:t>
             </w:r>
           </w:p>
         </w:tc>
         <w:tc>
           <w:tcPr>
-            <w:tcW w:type="dxa" w:w="2880"/>
+            <w:tcW w:type="dxa" w:w="3213"/>
+            <w:vAlign w:val="center"/>
+            <w:shd w:fill="FFFDF5"/>
           </w:tcPr>
           <w:p>
             <w:r/>
             <w:r>
-              <w:t>工作機會與時間取捨；不沿用雙考試並行</w:t>
+              <w:t>650</w:t>
             </w:r>
           </w:p>
         </w:tc>
         <w:tc>
           <w:tcPr>
-            <w:tcW w:type="dxa" w:w="2880"/>
+            <w:tcW w:type="dxa" w:w="3213"/>
+            <w:vAlign w:val="center"/>
+            <w:shd w:fill="FFFDF5"/>
           </w:tcPr>
           <w:p>
             <w:r/>
             <w:r>
-              <w:t>我調整優先順序</w:t>
+              <w:t>13章 × 每章50題</w:t>
             </w:r>
           </w:p>
         </w:tc>
@@ -539,34 +564,40 @@
       <w:tr>
         <w:tc>
           <w:tcPr>
-            <w:tcW w:type="dxa" w:w="2880"/>
+            <w:tcW w:type="dxa" w:w="3213"/>
+            <w:vAlign w:val="center"/>
+            <w:shd w:fill="F8E8C6"/>
           </w:tcPr>
           <w:p>
             <w:r/>
             <w:r>
-              <w:t>已確認：90 分以上，11/7 前準備完</w:t>
+              <w:t>首輪唯一已作答</w:t>
             </w:r>
           </w:p>
         </w:tc>
         <w:tc>
           <w:tcPr>
-            <w:tcW w:type="dxa" w:w="2880"/>
+            <w:tcW w:type="dxa" w:w="3213"/>
+            <w:vAlign w:val="center"/>
+            <w:shd w:fill="F8E8C6"/>
           </w:tcPr>
           <w:p>
             <w:r/>
             <w:r>
-              <w:t>留一週衝刺；不把及格當唯一標準</w:t>
+              <w:t>46</w:t>
             </w:r>
           </w:p>
         </w:tc>
         <w:tc>
           <w:tcPr>
-            <w:tcW w:type="dxa" w:w="2880"/>
+            <w:tcW w:type="dxa" w:w="3213"/>
+            <w:vAlign w:val="center"/>
+            <w:shd w:fill="F8E8C6"/>
           </w:tcPr>
           <w:p>
             <w:r/>
             <w:r>
-              <w:t>我改目標或期程</w:t>
+              <w:t>覆蓋率 7.08%</w:t>
             </w:r>
           </w:p>
         </w:tc>
@@ -574,34 +605,40 @@
       <w:tr>
         <w:tc>
           <w:tcPr>
-            <w:tcW w:type="dxa" w:w="2880"/>
+            <w:tcW w:type="dxa" w:w="3213"/>
+            <w:vAlign w:val="center"/>
+            <w:shd w:fill="FFFDF5"/>
           </w:tcPr>
           <w:p>
             <w:r/>
             <w:r>
-              <w:t>已確認：知臨主教練、CC 覆核</w:t>
+              <w:t>答對／答錯</w:t>
             </w:r>
           </w:p>
         </w:tc>
         <w:tc>
           <w:tcPr>
-            <w:tcW w:type="dxa" w:w="2880"/>
+            <w:tcW w:type="dxa" w:w="3213"/>
+            <w:vAlign w:val="center"/>
+            <w:shd w:fill="FFFDF5"/>
           </w:tcPr>
           <w:p>
             <w:r/>
             <w:r>
-              <w:t>一份整合安排；不各發作業</w:t>
+              <w:t>38／8</w:t>
             </w:r>
           </w:p>
         </w:tc>
         <w:tc>
           <w:tcPr>
-            <w:tcW w:type="dxa" w:w="2880"/>
+            <w:tcW w:type="dxa" w:w="3213"/>
+            <w:vAlign w:val="center"/>
+            <w:shd w:fill="FFFDF5"/>
           </w:tcPr>
           <w:p>
             <w:r/>
             <w:r>
-              <w:t>協作負荷或品質需調整</w:t>
+              <w:t>只計有選答案且可判分</w:t>
             </w:r>
           </w:p>
         </w:tc>
@@ -609,34 +646,40 @@
       <w:tr>
         <w:tc>
           <w:tcPr>
-            <w:tcW w:type="dxa" w:w="2880"/>
+            <w:tcW w:type="dxa" w:w="3213"/>
+            <w:vAlign w:val="center"/>
+            <w:shd w:fill="F8E8C6"/>
           </w:tcPr>
           <w:p>
             <w:r/>
             <w:r>
-              <w:t>已確認：一週刷原庫 650 題</w:t>
+              <w:t>累計正確率</w:t>
             </w:r>
           </w:p>
         </w:tc>
         <w:tc>
           <w:tcPr>
-            <w:tcW w:type="dxa" w:w="2880"/>
+            <w:tcW w:type="dxa" w:w="3213"/>
+            <w:vAlign w:val="center"/>
+            <w:shd w:fill="F8E8C6"/>
           </w:tcPr>
           <w:p>
             <w:r/>
             <w:r>
-              <w:t>全題覆蓋；取代原較慢首輪節奏</w:t>
+              <w:t>82.61%</w:t>
             </w:r>
           </w:p>
         </w:tc>
         <w:tc>
           <w:tcPr>
-            <w:tcW w:type="dxa" w:w="2880"/>
+            <w:tcW w:type="dxa" w:w="3213"/>
+            <w:vAlign w:val="center"/>
+            <w:shd w:fill="F8E8C6"/>
           </w:tcPr>
           <w:p>
             <w:r/>
             <w:r>
-              <w:t>實際負荷需提出調整</w:t>
+              <w:t>尚未達到90分目標</w:t>
             </w:r>
           </w:p>
         </w:tc>
@@ -644,34 +687,40 @@
       <w:tr>
         <w:tc>
           <w:tcPr>
-            <w:tcW w:type="dxa" w:w="2880"/>
+            <w:tcW w:type="dxa" w:w="3213"/>
+            <w:vAlign w:val="center"/>
+            <w:shd w:fill="FFFDF5"/>
           </w:tcPr>
           <w:p>
             <w:r/>
             <w:r>
-              <w:t>已確認：對話三題一組</w:t>
+              <w:t>剩餘未首輪作答</w:t>
             </w:r>
           </w:p>
         </w:tc>
         <w:tc>
           <w:tcPr>
-            <w:tcW w:type="dxa" w:w="2880"/>
+            <w:tcW w:type="dxa" w:w="3213"/>
+            <w:vAlign w:val="center"/>
+            <w:shd w:fill="FFFDF5"/>
           </w:tcPr>
           <w:p>
             <w:r/>
             <w:r>
-              <w:t>操作快速；互動網頁已取消</w:t>
+              <w:t>604</w:t>
             </w:r>
           </w:p>
         </w:tc>
         <w:tc>
           <w:tcPr>
-            <w:tcW w:type="dxa" w:w="2880"/>
+            <w:tcW w:type="dxa" w:w="3213"/>
+            <w:vAlign w:val="center"/>
+            <w:shd w:fill="FFFDF5"/>
           </w:tcPr>
           <w:p>
             <w:r/>
             <w:r>
-              <w:t>我要求重啟網頁</w:t>
+              <w:t>講過但未選仍不算完成</w:t>
             </w:r>
           </w:p>
         </w:tc>
@@ -679,34 +728,40 @@
       <w:tr>
         <w:tc>
           <w:tcPr>
-            <w:tcW w:type="dxa" w:w="2880"/>
+            <w:tcW w:type="dxa" w:w="3213"/>
+            <w:vAlign w:val="center"/>
+            <w:shd w:fill="F8E8C6"/>
           </w:tcPr>
           <w:p>
             <w:r/>
             <w:r>
-              <w:t>已確認：原 HTML 題與個別 A～D</w:t>
+              <w:t>已製作知識圖卡</w:t>
             </w:r>
           </w:p>
         </w:tc>
         <w:tc>
           <w:tcPr>
-            <w:tcW w:type="dxa" w:w="2880"/>
+            <w:tcW w:type="dxa" w:w="3213"/>
+            <w:vAlign w:val="center"/>
+            <w:shd w:fill="F8E8C6"/>
           </w:tcPr>
           <w:p>
             <w:r/>
             <w:r>
-              <w:t>來源可核對；不自編替代題</w:t>
+              <w:t>33</w:t>
             </w:r>
           </w:p>
         </w:tc>
         <w:tc>
           <w:tcPr>
-            <w:tcW w:type="dxa" w:w="2880"/>
+            <w:tcW w:type="dxa" w:w="3213"/>
+            <w:vAlign w:val="center"/>
+            <w:shd w:fill="F8E8C6"/>
           </w:tcPr>
           <w:p>
             <w:r/>
             <w:r>
-              <w:t>我授權其他題源</w:t>
+              <w:t>教材成果，不等於33題學會</w:t>
             </w:r>
           </w:p>
         </w:tc>
@@ -714,112 +769,54 @@
       <w:tr>
         <w:tc>
           <w:tcPr>
-            <w:tcW w:type="dxa" w:w="2880"/>
+            <w:tcW w:type="dxa" w:w="3213"/>
+            <w:vAlign w:val="center"/>
+            <w:shd w:fill="FFFDF5"/>
           </w:tcPr>
           <w:p>
             <w:r/>
             <w:r>
-              <w:t>已確認：每題不懂都要補講製圖</w:t>
+              <w:t>待回測日期</w:t>
             </w:r>
           </w:p>
         </w:tc>
         <w:tc>
           <w:tcPr>
-            <w:tcW w:type="dxa" w:w="2880"/>
+            <w:tcW w:type="dxa" w:w="3213"/>
+            <w:vAlign w:val="center"/>
+            <w:shd w:fill="FFFDF5"/>
           </w:tcPr>
           <w:p>
             <w:r/>
             <w:r>
-              <w:t>不採整批一張或口頭說完成</w:t>
+              <w:t>10/22、10/24、10/28</w:t>
             </w:r>
           </w:p>
         </w:tc>
         <w:tc>
           <w:tcPr>
-            <w:tcW w:type="dxa" w:w="2880"/>
+            <w:tcW w:type="dxa" w:w="3213"/>
+            <w:vAlign w:val="center"/>
+            <w:shd w:fill="FFFDF5"/>
           </w:tcPr>
           <w:p>
             <w:r/>
             <w:r>
-              <w:t>我調整交付方式</w:t>
-            </w:r>
-          </w:p>
-        </w:tc>
-      </w:tr>
-      <w:tr>
-        <w:tc>
-          <w:tcPr>
-            <w:tcW w:type="dxa" w:w="2880"/>
-          </w:tcPr>
-          <w:p>
-            <w:r/>
-            <w:r>
-              <w:t>已確認：諧音僅限私聊</w:t>
-            </w:r>
-          </w:p>
-        </w:tc>
-        <w:tc>
-          <w:tcPr>
-            <w:tcW w:type="dxa" w:w="2880"/>
-          </w:tcPr>
-          <w:p>
-            <w:r/>
-            <w:r>
-              <w:t>分享卡保持正式簡潔</w:t>
-            </w:r>
-          </w:p>
-        </w:tc>
-        <w:tc>
-          <w:tcPr>
-            <w:tcW w:type="dxa" w:w="2880"/>
-          </w:tcPr>
-          <w:p>
-            <w:r/>
-            <w:r>
-              <w:t>我另指定私人版卡</w:t>
-            </w:r>
-          </w:p>
-        </w:tc>
-      </w:tr>
-      <w:tr>
-        <w:tc>
-          <w:tcPr>
-            <w:tcW w:type="dxa" w:w="2880"/>
-          </w:tcPr>
-          <w:p>
-            <w:r/>
-            <w:r>
-              <w:t>已確認：說繼續作答才出題</w:t>
-            </w:r>
-          </w:p>
-        </w:tc>
-        <w:tc>
-          <w:tcPr>
-            <w:tcW w:type="dxa" w:w="2880"/>
-          </w:tcPr>
-          <w:p>
-            <w:r/>
-            <w:r>
-              <w:t>我保留理解與節奏控制權</w:t>
-            </w:r>
-          </w:p>
-        </w:tc>
-        <w:tc>
-          <w:tcPr>
-            <w:tcW w:type="dxa" w:w="2880"/>
-          </w:tcPr>
-          <w:p>
-            <w:r/>
-            <w:r>
-              <w:t>我明確更改節奏</w:t>
+              <w:t>依1／3／7天節奏安排</w:t>
             </w:r>
           </w:p>
         </w:tc>
       </w:tr>
     </w:tbl>
+    <w:p/>
     <w:p>
       <w:r>
-        <w:t>AI 建議的工作排序：現在先守住原題、理解與逐題交付（NOW）；用延後回想驗證學會（TEST）；互動網站暫停（PARK）；額外新工具不搶走讀書時間。日誌範圍以完整對話為準，不能因輸出方便而縮成最後案例。</w:t>
+        <w:t>章節覆蓋目前為：L22101 已答 28／50、L22102 已答 17／50、L22401 已答 1／50，其餘十章仍為 0／50。這代表前兩章已有初步樣本，但全範圍覆蓋仍不足。</w:t>
+      </w:r>
+    </w:p>
+    <w:p>
+      <w:r>
+        <w:t>已講解但尚未完成首輪選答的題號包括 16、38、39、45、51、58、64、69、71、72、75、80、270。它們要留在回測或補答佇列，不能因為聽懂說明就自動變成答對。</w:t>
       </w:r>
     </w:p>
     <w:p>
@@ -827,23 +824,114 @@
         <w:pStyle w:val="Heading2"/>
       </w:pPr>
       <w:r>
-        <w:t>學習關鍵字：概念與協作都要能找回</w:t>
+        <w:t>現行操作手冊：每批十題怎麼跑</w:t>
+      </w:r>
+    </w:p>
+    <w:p>
+      <w:pPr>
+        <w:pStyle w:val="ListNumber"/>
+      </w:pPr>
+      <w:r>
+        <w:t>Tarshar 在固定 CC 測驗室說「開始考試」或「繼續作答」。</w:t>
+      </w:r>
+    </w:p>
+    <w:p>
+      <w:pPr>
+        <w:pStyle w:val="ListNumber"/>
+      </w:pPr>
+      <w:r>
+        <w:t>CC 從尚未作答的 650 題選十題，逐題核對 JSON、原 HTML 與核稿狀態。</w:t>
+      </w:r>
+    </w:p>
+    <w:p>
+      <w:pPr>
+        <w:pStyle w:val="ListNumber"/>
+      </w:pPr>
+      <w:r>
+        <w:t>CC 保留原題幹、A～D 選項與順序，標示全庫 ID、章節代碼及章內題號。</w:t>
+      </w:r>
+    </w:p>
+    <w:p>
+      <w:pPr>
+        <w:pStyle w:val="ListNumber"/>
+      </w:pPr>
+      <w:r>
+        <w:t>Tarshar 一次回覆十題；可用「？」或文字標記沒讀過、不懂、常搞混。</w:t>
+      </w:r>
+    </w:p>
+    <w:p>
+      <w:pPr>
+        <w:pStyle w:val="ListNumber"/>
+      </w:pPr>
+      <w:r>
+        <w:t>CC 立即列出十題的本人答案、原題正解與對錯；未選明列為未作答。</w:t>
+      </w:r>
+    </w:p>
+    <w:p>
+      <w:pPr>
+        <w:pStyle w:val="ListNumber"/>
+      </w:pPr>
+      <w:r>
+        <w:t>CC 只講錯題、未答、不確定與追問題，採具體例子→動作或數字→正式名詞的順序。</w:t>
+      </w:r>
+    </w:p>
+    <w:p>
+      <w:pPr>
+        <w:pStyle w:val="ListNumber"/>
+      </w:pPr>
+      <w:r>
+        <w:t>每個疑難觀念等 Tarshar 明確表示懂了；仍不懂就留在原題換一個例子。</w:t>
+      </w:r>
+    </w:p>
+    <w:p>
+      <w:pPr>
+        <w:pStyle w:val="ListNumber"/>
+      </w:pPr>
+      <w:r>
+        <w:t>CC 寫交班 JSON 並停下，不自動出下一批。</w:t>
+      </w:r>
+    </w:p>
+    <w:p>
+      <w:pPr>
+        <w:pStyle w:val="ListNumber"/>
+      </w:pPr>
+      <w:r>
+        <w:t>知臨核對交班，更新共同正本；理解確認且需要圖卡的項目才進製卡、上傳與回測。</w:t>
+      </w:r>
+    </w:p>
+    <w:p>
+      <w:pPr>
+        <w:pStyle w:val="ListNumber"/>
+      </w:pPr>
+      <w:r>
+        <w:t>21:00 日結照實顯示進度與差距；下一批仍由 Tarshar 的口令啟動。</w:t>
+      </w:r>
+    </w:p>
+    <w:p>
+      <w:pPr>
+        <w:pStyle w:val="Heading2"/>
+      </w:pPr>
+      <w:r>
+        <w:t>決策帳：現在採用什麼</w:t>
       </w:r>
     </w:p>
     <w:tbl>
       <w:tblPr>
-        <w:tblStyle w:val="LightGrid-Accent1"/>
+        <w:tblStyle w:val="TableGrid"/>
         <w:tblW w:type="auto" w:w="0"/>
+        <w:jc w:val="center"/>
         <w:tblLook w:firstColumn="1" w:firstRow="1" w:lastColumn="0" w:lastRow="0" w:noHBand="0" w:noVBand="1" w:val="04A0"/>
       </w:tblPr>
       <w:tblGrid>
-        <w:gridCol w:w="4320"/>
-        <w:gridCol w:w="4320"/>
+        <w:gridCol w:w="4819"/>
+        <w:gridCol w:w="4819"/>
       </w:tblGrid>
       <w:tr>
         <w:tc>
           <w:tcPr>
-            <w:tcW w:type="dxa" w:w="4320"/>
+            <w:tcW w:type="dxa" w:w="4819"/>
+            <w:vAlign w:val="center"/>
+            <w:shd w:fill="CBD7AB"/>
           </w:tcPr>
           <w:p>
             <w:r>
@@ -855,13 +943,15 @@
               <w:rPr>
                 <w:b/>
               </w:rPr>
-              <w:t>關鍵字</w:t>
+              <w:t>決定</w:t>
             </w:r>
           </w:p>
         </w:tc>
         <w:tc>
           <w:tcPr>
-            <w:tcW w:type="dxa" w:w="4320"/>
+            <w:tcW w:type="dxa" w:w="4819"/>
+            <w:vAlign w:val="center"/>
+            <w:shd w:fill="CBD7AB"/>
           </w:tcPr>
           <w:p>
             <w:r>
@@ -873,7 +963,7 @@
               <w:rPr>
                 <w:b/>
               </w:rPr>
-              <w:t>白話與本次例子</w:t>
+              <w:t>現行狀態與理由</w:t>
             </w:r>
           </w:p>
         </w:tc>
@@ -881,23 +971,27 @@
       <w:tr>
         <w:tc>
           <w:tcPr>
-            <w:tcW w:type="dxa" w:w="4320"/>
+            <w:tcW w:type="dxa" w:w="4819"/>
+            <w:vAlign w:val="center"/>
+            <w:shd w:fill="FFFDF5"/>
           </w:tcPr>
           <w:p>
             <w:r/>
             <w:r>
-              <w:t>ACID 交易特性</w:t>
+              <w:t>延後就服乙級、集中 L22</w:t>
             </w:r>
           </w:p>
         </w:tc>
         <w:tc>
           <w:tcPr>
-            <w:tcW w:type="dxa" w:w="4320"/>
+            <w:tcW w:type="dxa" w:w="4819"/>
+            <w:vAlign w:val="center"/>
+            <w:shd w:fill="FFFDF5"/>
           </w:tcPr>
           <w:p>
             <w:r/>
             <w:r>
-              <w:t>原子性、一致性、隔離性、持久性；已提交的資料重啟仍留存，是持久性的例子</w:t>
+              <w:t>已確認；把有限時間集中在目前更有工作先機的目標</w:t>
             </w:r>
           </w:p>
         </w:tc>
@@ -905,23 +999,27 @@
       <w:tr>
         <w:tc>
           <w:tcPr>
-            <w:tcW w:type="dxa" w:w="4320"/>
+            <w:tcW w:type="dxa" w:w="4819"/>
+            <w:vAlign w:val="center"/>
+            <w:shd w:fill="F8E8C6"/>
           </w:tcPr>
           <w:p>
             <w:r/>
             <w:r>
-              <w:t>資料縮放 Scaling</w:t>
+              <w:t>目標90分以上</w:t>
             </w:r>
           </w:p>
         </w:tc>
         <w:tc>
           <w:tcPr>
-            <w:tcW w:type="dxa" w:w="4320"/>
+            <w:tcW w:type="dxa" w:w="4819"/>
+            <w:vAlign w:val="center"/>
+            <w:shd w:fill="F8E8C6"/>
           </w:tcPr>
           <w:p>
             <w:r/>
             <w:r>
-              <w:t>調整數值尺度；Min-Max、Z-score、Robust 用不同基準，不能只背英文</w:t>
+              <w:t>已確認；11/6完成能力準備，11/7驗收，保留一週衝刺</w:t>
             </w:r>
           </w:p>
         </w:tc>
@@ -929,23 +1027,27 @@
       <w:tr>
         <w:tc>
           <w:tcPr>
-            <w:tcW w:type="dxa" w:w="4320"/>
+            <w:tcW w:type="dxa" w:w="4819"/>
+            <w:vAlign w:val="center"/>
+            <w:shd w:fill="FFFDF5"/>
           </w:tcPr>
           <w:p>
             <w:r/>
             <w:r>
-              <w:t>獨熱編碼 One-Hot Encoding</w:t>
+              <w:t>650題原庫是唯一正式題源</w:t>
             </w:r>
           </w:p>
         </w:tc>
         <w:tc>
           <w:tcPr>
-            <w:tcW w:type="dxa" w:w="4320"/>
+            <w:tcW w:type="dxa" w:w="4819"/>
+            <w:vAlign w:val="center"/>
+            <w:shd w:fill="FFFDF5"/>
           </w:tcPr>
           <w:p>
             <w:r/>
             <w:r>
-              <w:t>每個類型各一欄；選綠茶對應沒選、有選、沒選，再變成 0、1、0</w:t>
+              <w:t>已確認；禁止AI自編題冒充題庫</w:t>
             </w:r>
           </w:p>
         </w:tc>
@@ -953,23 +1055,27 @@
       <w:tr>
         <w:tc>
           <w:tcPr>
-            <w:tcW w:type="dxa" w:w="4320"/>
+            <w:tcW w:type="dxa" w:w="4819"/>
+            <w:vAlign w:val="center"/>
+            <w:shd w:fill="F8E8C6"/>
           </w:tcPr>
           <w:p>
             <w:r/>
             <w:r>
-              <w:t>基數 Cardinality</w:t>
+              <w:t>每批固定10題</w:t>
             </w:r>
           </w:p>
         </w:tc>
         <w:tc>
           <w:tcPr>
-            <w:tcW w:type="dxa" w:w="4320"/>
+            <w:tcW w:type="dxa" w:w="4819"/>
+            <w:vAlign w:val="center"/>
+            <w:shd w:fill="F8E8C6"/>
           </w:tcPr>
           <w:p>
             <w:r/>
             <w:r>
-              <w:t>一個欄位有幾種不同取值；杯數很多不代表品項很多</w:t>
+              <w:t>已確認；由3題、5題加速而來</w:t>
             </w:r>
           </w:p>
         </w:tc>
@@ -977,23 +1083,27 @@
       <w:tr>
         <w:tc>
           <w:tcPr>
-            <w:tcW w:type="dxa" w:w="4320"/>
+            <w:tcW w:type="dxa" w:w="4819"/>
+            <w:vAlign w:val="center"/>
+            <w:shd w:fill="FFFDF5"/>
           </w:tcPr>
           <w:p>
             <w:r/>
             <w:r>
-              <w:t>分組計數 Grouped Count</w:t>
+              <w:t>每批對完立即說明</w:t>
             </w:r>
           </w:p>
         </w:tc>
         <w:tc>
           <w:tcPr>
-            <w:tcW w:type="dxa" w:w="4320"/>
+            <w:tcW w:type="dxa" w:w="4819"/>
+            <w:vAlign w:val="center"/>
+            <w:shd w:fill="FFFDF5"/>
           </w:tcPr>
           <w:p>
             <w:r/>
             <w:r>
-              <w:t>把同類項目合計；統計每種飲料賣幾杯</w:t>
+              <w:t>已確認；避免留到日終時忘記當時的疑問</w:t>
             </w:r>
           </w:p>
         </w:tc>
@@ -1001,23 +1111,27 @@
       <w:tr>
         <w:tc>
           <w:tcPr>
-            <w:tcW w:type="dxa" w:w="4320"/>
+            <w:tcW w:type="dxa" w:w="4819"/>
+            <w:vAlign w:val="center"/>
+            <w:shd w:fill="F8E8C6"/>
           </w:tcPr>
           <w:p>
             <w:r/>
             <w:r>
-              <w:t>間隔複習 Spaced Practice</w:t>
+              <w:t>CC主持測驗與教學</w:t>
             </w:r>
           </w:p>
         </w:tc>
         <w:tc>
           <w:tcPr>
-            <w:tcW w:type="dxa" w:w="4320"/>
+            <w:tcW w:type="dxa" w:w="4819"/>
+            <w:vAlign w:val="center"/>
+            <w:shd w:fill="F8E8C6"/>
           </w:tcPr>
           <w:p>
             <w:r/>
             <w:r>
-              <w:t>隔一段時間再回顧；本案安排第 1、3、7 天，不把排程當完成</w:t>
+              <w:t>已確認；固定可見測驗室，等口令才出題</w:t>
             </w:r>
           </w:p>
         </w:tc>
@@ -1025,23 +1139,27 @@
       <w:tr>
         <w:tc>
           <w:tcPr>
-            <w:tcW w:type="dxa" w:w="4320"/>
+            <w:tcW w:type="dxa" w:w="4819"/>
+            <w:vAlign w:val="center"/>
+            <w:shd w:fill="FFFDF5"/>
           </w:tcPr>
           <w:p>
             <w:r/>
             <w:r>
-              <w:t>提取練習 Retrieval Practice</w:t>
+              <w:t>知臨彙整、製卡與追蹤</w:t>
             </w:r>
           </w:p>
         </w:tc>
         <w:tc>
           <w:tcPr>
-            <w:tcW w:type="dxa" w:w="4320"/>
+            <w:tcW w:type="dxa" w:w="4819"/>
+            <w:vAlign w:val="center"/>
+            <w:shd w:fill="FFFDF5"/>
           </w:tcPr>
           <w:p>
             <w:r/>
             <w:r>
-              <w:t>不看答案回想；用來分辨當下聽懂與之後記得</w:t>
+              <w:t>已確認；單一寫入端避免兩邊覆寫</w:t>
             </w:r>
           </w:p>
         </w:tc>
@@ -1049,23 +1167,27 @@
       <w:tr>
         <w:tc>
           <w:tcPr>
-            <w:tcW w:type="dxa" w:w="4320"/>
+            <w:tcW w:type="dxa" w:w="4819"/>
+            <w:vAlign w:val="center"/>
+            <w:shd w:fill="F8E8C6"/>
           </w:tcPr>
           <w:p>
             <w:r/>
             <w:r>
-              <w:t>題庫覆蓋 Coverage</w:t>
+              <w:t>圖卡先過理解閘門</w:t>
             </w:r>
           </w:p>
         </w:tc>
         <w:tc>
           <w:tcPr>
-            <w:tcW w:type="dxa" w:w="4320"/>
+            <w:tcW w:type="dxa" w:w="4819"/>
+            <w:vAlign w:val="center"/>
+            <w:shd w:fill="F8E8C6"/>
           </w:tcPr>
           <w:p>
             <w:r/>
             <w:r>
-              <w:t>多少不同原題實際答過；重做、圖卡與自編題不增加 650 題覆蓋</w:t>
+              <w:t>已確認；不把仍看不懂的說法固化成教材</w:t>
             </w:r>
           </w:p>
         </w:tc>
@@ -1073,23 +1195,27 @@
       <w:tr>
         <w:tc>
           <w:tcPr>
-            <w:tcW w:type="dxa" w:w="4320"/>
+            <w:tcW w:type="dxa" w:w="4819"/>
+            <w:vAlign w:val="center"/>
+            <w:shd w:fill="FFFDF5"/>
           </w:tcPr>
           <w:p>
             <w:r/>
             <w:r>
-              <w:t>可追溯性 Traceability</w:t>
+              <w:t>互動練習網頁</w:t>
             </w:r>
           </w:p>
         </w:tc>
         <w:tc>
           <w:tcPr>
-            <w:tcW w:type="dxa" w:w="4320"/>
+            <w:tcW w:type="dxa" w:w="4819"/>
+            <w:vAlign w:val="center"/>
+            <w:shd w:fill="FFFDF5"/>
           </w:tcPr>
           <w:p>
             <w:r/>
             <w:r>
-              <w:t>從進度回到題號、說明、圖卡與回測證據，不靠總數猜完成</w:t>
+              <w:t>已取消；對話作答更快，圖解與下載檔仍保留</w:t>
             </w:r>
           </w:p>
         </w:tc>
@@ -1097,36 +1223,59 @@
       <w:tr>
         <w:tc>
           <w:tcPr>
-            <w:tcW w:type="dxa" w:w="4320"/>
+            <w:tcW w:type="dxa" w:w="4819"/>
+            <w:vAlign w:val="center"/>
+            <w:shd w:fill="F8E8C6"/>
           </w:tcPr>
           <w:p>
             <w:r/>
             <w:r>
-              <w:t>範圍漂移 Scope Drift</w:t>
+              <w:t>中文近似唸法</w:t>
             </w:r>
           </w:p>
         </w:tc>
         <w:tc>
           <w:tcPr>
-            <w:tcW w:type="dxa" w:w="4320"/>
+            <w:tcW w:type="dxa" w:w="4819"/>
+            <w:vAlign w:val="center"/>
+            <w:shd w:fill="F8E8C6"/>
           </w:tcPr>
           <w:p>
             <w:r/>
             <w:r>
-              <w:t>原本要完整備考歷程，卻寫成最後的飲料案例；主題被局部取代</w:t>
+              <w:t>只在私聊小抄；分享圖卡不放</w:t>
             </w:r>
           </w:p>
         </w:tc>
       </w:tr>
     </w:tbl>
+    <w:p/>
     <w:p>
+      <w:pPr>
+        <w:pStyle w:val="Heading2"/>
+      </w:pPr>
       <w:r>
-        <w:t>本表是回看入口，不取代完整教學。縮放方法仍要依情境、離群值與資料分布解釋，不能從這張短表直接判斷已學會。</w:t>
+        <w:t>AI被我修正後，留下哪些可重用規則</w:t>
       </w:r>
     </w:p>
     <w:p>
       <w:r>
-        <w:t>可重用檢核：先核對來源與目的，再選教學例子；講完查理解，交付查逐題對應，日誌查完整演變。</w:t>
+        <w:t>第一，不能因最近一個例子好寫，就把完整專案縮成那個例子。第一版日誌只寫「一杯綠茶」，我要求重做，才回到從取捨、目標、題庫、教學到交班系統的完整主線。</w:t>
+      </w:r>
+    </w:p>
+    <w:p>
+      <w:r>
+        <w:t>第二，派工不能只存在 AI 內部。若我看不到 CC 的對話、不能從手機接續，就不算可用的協作。固定入口、可見標題、釘選與歷史，比「已派工」四個字更重要。</w:t>
+      </w:r>
+    </w:p>
+    <w:p>
+      <w:r>
+        <w:t>第三，完成教材不等於完成學習。圖卡、Word、說明與排程都只是支援；作答覆蓋、延遲回測與限時成績才是能力證據。</w:t>
+      </w:r>
+    </w:p>
+    <w:p>
+      <w:r>
+        <w:t>第四，雙 AI 的價值來自權責與資料流清楚。誰出題、誰寫進度、誰製卡、哪個檔案是正本，都要明確；否則兩個 AI 只會產生兩份待整理的工作。</w:t>
       </w:r>
     </w:p>
     <w:p>
@@ -1134,32 +1283,22 @@
         <w:pStyle w:val="Heading2"/>
       </w:pPr>
       <w:r>
-        <w:t>研究連結：哪些能當素材，哪些不能下結論</w:t>
+        <w:t>學習與研究入口</w:t>
       </w:r>
     </w:p>
     <w:p>
       <w:r>
-        <w:t>可搜尋題目一：使用者回饋如何校準 AI 教學。關鍵字為教學鷹架／Instructional Scaffolding、使用者控制／Learner Control。案例是拒絕燈的比喻、接受飲料選擇的步驟，以及要求說繼續才出題。可放在案例分析或研究動機；證據是這段對話與自述理解，還需延後測驗，不能宣稱已提高考試分數。</w:t>
+        <w:t>本案可延伸三個研究方向。第一是教學鷹架與學習者控制：我拒絕抽象「燈」比喻、接受飲料店的逐步轉換，也要求未理解時不得往下。第二是人機協作中的可追溯性與協調負擔：逐題交班、固定入口與單一正本是否能減少我追著提醒。第三是長上下文與近因偏誤：為什麼 AI 容易把最近的綠茶故事誤當成整段協作主線。</w:t>
       </w:r>
     </w:p>
     <w:p>
       <w:r>
-        <w:t>可搜尋題目二：人機協作中的追蹤責任。關鍵字為任務可追溯性／Task Traceability、協作負擔／Coordination Burden。案例是我重複提醒缺卡、署名錯誤、雲端歸檔與私人諧音混入分享版。可放在系統設計與討論；需比較修正前後漏交率、提醒次數，不能只因建立規則就宣稱負擔已下降。</w:t>
+        <w:t>可搜尋關鍵字包括：Instructional Scaffolding（教學鷹架）、Learner Control（學習者控制）、Retrieval Practice（提取練習）、Spaced Practice（間隔複習）、Task Traceability（任務可追溯性）、Coordination Burden（協調負擔）、Long Context（長上下文）與 Recency Bias（近因偏誤）。</w:t>
       </w:r>
     </w:p>
     <w:p>
       <w:r>
-        <w:t>可搜尋題目三：長對話摘要的範圍完整性。關鍵字為長上下文／Long Context、近因偏誤／Recency Bias。案例是第一版日誌用最近的綠茶故事取代整段備考演變。可放在方法或失敗案例討論；需更多對話、明確涵蓋評分與獨立審查，不能由單案推論所有模型都一樣。</w:t>
-      </w:r>
-    </w:p>
-    <w:p>
-      <w:r>
-        <w:t>以上均為 AI 建議的研究入口，證據狀態是現場協作紀錄，並非文獻研究結果或已建立因果。Tarshar 尚未因此確立新的論文題目。</w:t>
-      </w:r>
-    </w:p>
-    <w:p>
-      <w:r>
-        <w:t>本案可主張的是需求如何被提出、誤解與修正，以及交付規則如何改變；目前不能主張已達 90 分、已長期記住，或新流程必然不再出錯。</w:t>
+        <w:t>目前證據是這次現場協作紀錄與進度資料，能描述需求如何被提出、誤解與修正；還不能宣稱新流程已提高實考分數，或已證明任何普遍因果。</w:t>
       </w:r>
     </w:p>
     <w:p>
@@ -1167,22 +1306,12 @@
         <w:pStyle w:val="Heading2"/>
       </w:pPr>
       <w:r>
-        <w:t>成果、限制與接力：故事仍在進行</w:t>
+        <w:t>交付與驗收：成果位置、安全界線與待驗證</w:t>
       </w:r>
     </w:p>
     <w:p>
       <w:r>
-        <w:t>現行成果包括：L22 備考規劃、13 單元檢核、每日進度與題號追蹤、逐題圖卡交付規則，以及雲端 11 張知識圖卡。這些是系統與教材的成果，不是 11 題已答或 13 單元已通過。</w:t>
-      </w:r>
-    </w:p>
-    <w:p>
-      <w:r>
-        <w:t>截至本次紀錄，原庫實際作答為 ID13 與 ID463，共 2／650，兩題答對；ID270 自述不清楚、未選答案，記未答需補強。650 題仍剩 648 題。兩題正確不足以推估 90 分能力。今日 93 題目標與已答 2 題之間，還差 91 題；不補填假進度。</w:t>
-      </w:r>
-    </w:p>
-    <w:p>
-      <w:r>
-        <w:t>待驗證：全庫一週刷完是否可負荷？全部曝光後，原庫還有多少未見題可作獨立檢核？197 題核稿標記要如何逐題處理？若題源或時間不足，應先報告限制，不私自添加新題，也不把熟題高分等同未見題表現。</w:t>
+        <w:t>成果狀態已確認：現行成果包括650 題逐題進度、每日結算、錯題與回測佇列、CC 交班規格、可列印題庫 Word、33 張知識圖卡，以及本版 Word、PDF、HTML、封面與雙核心架構圖。</w:t>
       </w:r>
     </w:p>
     <w:p>
@@ -1192,37 +1321,72 @@
     </w:p>
     <w:p>
       <w:r>
-        <w:t>日誌與貼文下載資料夾</w:t>
+        <w:t>日誌與可下載成品資料夾</w:t>
       </w:r>
     </w:p>
     <w:p>
       <w:r>
-        <w:t>產出狀態：本版 v2.0 是完整對話範圍的重寫稿，包含 Word、PDF、HTML、封面與演變架構圖；第一版局部日誌被取代。FB 同步改成整段備考協作視角，尚未發布。CC 尚未覆核新版日誌。</w:t>
+        <w:t>待驗證事項仍包括90分能力、延遲回測留存率與剩餘604題的完成節奏。</w:t>
       </w:r>
     </w:p>
     <w:p>
       <w:r>
-        <w:t>下一步是閱讀新版是否忠實保存整段過程；回到備考時，依現行紀錄補強，等我說「繼續作答」才出題。本次重寫沒有新增作答。</w:t>
+        <w:t>GitHub 共同大腦不保存付費題目全文、完整選項與詳解；本日誌只記題號、數量、規則與學習證據。這條界線讓 Codex 與 CC 能共讀進度，同時不把付費內容公開化。</w:t>
+      </w:r>
+    </w:p>
+    <w:p>
+      <w:pPr>
+        <w:pStyle w:val="Heading2"/>
+      </w:pPr>
+      <w:r>
+        <w:t>下一步：回到考試，不再重建工具</w:t>
       </w:r>
     </w:p>
     <w:p>
       <w:r>
-        <w:t>本次演化一句話：我從決定專攻 L22 開始，一步步把 AI 陪考改成有目標、有分工、看得懂、能追蹤，也必須對交付負責的學習流程。</w:t>
+        <w:t>系統已能接力，現在的主線不是再做一個新介面，而是提高題庫覆蓋與 90 分能力。下一個動作是由我在 CC 固定測驗室說「繼續作答」，完成下一批十題；CC 批改教學後交棒，知臨再更新進度與圖卡。</w:t>
       </w:r>
     </w:p>
     <w:p>
       <w:r>
-        <w:t>整理：知臨。依本對話全段、每日陪跑紀錄與現行逐題規則整理，2026-10-18。</w:t>
+        <w:t>同時必須處理 10 月 22 日到期的回測，並重新估算 604 題剩餘量如何在 11 月 6 日前完成。若原定一天 93 題無法負荷，要誠實調整每日配置與補強節奏，不以假進度換取漂亮百分比。</w:t>
+      </w:r>
+    </w:p>
+    <w:p>
+      <w:r>
+        <w:t>本次演化一句話：我把兩個 AI 從「都來幫忙」改造成一條有固定入口、單一正本、理解閘門、逐批交接與每日證據的 L22 陪考流水線。</w:t>
       </w:r>
     </w:p>
     <w:sectPr>
-      <w:pgSz w:w="12240" w:h="15840"/>
-      <w:pgMar w:top="1440" w:right="1800" w:bottom="1440" w:left="1800" w:header="720" w:footer="720" w:gutter="0"/>
+      <w:footerReference w:type="default" r:id="rId9"/>
+      <w:pgSz w:w="11906" w:h="16838"/>
+      <w:pgMar w:top="1020" w:right="1134" w:bottom="1020" w:left="1134" w:header="720" w:footer="720" w:gutter="0"/>
       <w:cols w:space="720"/>
       <w:docGrid w:linePitch="360"/>
     </w:sectPr>
   </w:body>
 </w:document>
+</file>
+
+<file path=word/footer1.xml><?xml version="1.0" encoding="utf-8"?>
+<w:ftr xmlns:m="http://schemas.openxmlformats.org/officeDocument/2006/math" xmlns:mc="http://schemas.openxmlformats.org/markup-compatibility/2006" xmlns:mo="http://schemas.microsoft.com/office/mac/office/2008/main" xmlns:mv="urn:schemas-microsoft-com:mac:vml" xmlns:o="urn:schemas-microsoft-com:office:office" xmlns:r="http://schemas.openxmlformats.org/officeDocument/2006/relationships" xmlns:v="urn:schemas-microsoft-com:vml" xmlns:w10="urn:schemas-microsoft-com:office:word" xmlns:w14="http://schemas.microsoft.com/office/word/2010/wordml" xmlns:w="http://schemas.openxmlformats.org/wordprocessingml/2006/main" xmlns:wne="http://schemas.microsoft.com/office/word/2006/wordml" xmlns:wp14="http://schemas.microsoft.com/office/word/2010/wordprocessingDrawing" xmlns:wp="http://schemas.openxmlformats.org/drawingml/2006/wordprocessingDrawing" xmlns:wpc="http://schemas.microsoft.com/office/word/2010/wordprocessingCanvas" xmlns:wpg="http://schemas.microsoft.com/office/word/2010/wordprocessingGroup" xmlns:wpi="http://schemas.microsoft.com/office/word/2010/wordprocessingInk" xmlns:wps="http://schemas.microsoft.com/office/word/2010/wordprocessingShape" mc:Ignorable="w14 wp14">
+  <w:p>
+    <w:pPr>
+      <w:pStyle w:val="Footer"/>
+      <w:jc w:val="center"/>
+    </w:pPr>
+    <w:r>
+      <w:rPr>
+        <w:sz w:val="16"/>
+      </w:rPr>
+      <w:t>Learn AI with Tarshar | 2026　｜　AI協作日誌</w:t>
+    </w:r>
+    <w:r>
+      <w:t xml:space="preserve">　｜　</w:t>
+    </w:r>
+    <w:fldSimple w:instr="PAGE"/>
+  </w:p>
+</w:ftr>
 </file>
 
 <file path=word/numbering.xml><?xml version="1.0" encoding="utf-8"?>
@@ -1588,6 +1752,9 @@
     <w:name w:val="Normal"/>
     <w:qFormat/>
     <w:rsid w:val="00FC693F"/>
+    <w:pPr>
+      <w:spacing w:after="120" w:line="324" w:lineRule="auto"/>
+    </w:pPr>
     <w:rPr>
       <w:rFonts w:ascii="Arial" w:hAnsi="Arial" w:eastAsia="PingFang TC"/>
       <w:sz w:val="22"/>
@@ -1648,15 +1815,16 @@
     <w:pPr>
       <w:keepNext/>
       <w:keepLines/>
-      <w:spacing w:before="480" w:after="0"/>
+      <w:spacing w:before="240" w:after="120"/>
+      <w:outlineLvl w:val="0"/>
       <w:outlineLvl w:val="0"/>
     </w:pPr>
     <w:rPr>
       <w:rFonts w:asciiTheme="majorHAnsi" w:eastAsiaTheme="majorEastAsia" w:hAnsiTheme="majorHAnsi" w:cstheme="majorBidi" w:ascii="Arial" w:hAnsi="Arial" w:eastAsia="PingFang TC"/>
       <w:b/>
       <w:bCs/>
-      <w:color w:val="365F91" w:themeColor="accent1" w:themeShade="BF"/>
-      <w:sz w:val="28"/>
+      <w:color w:val="4F612F"/>
+      <w:sz w:val="48"/>
       <w:szCs w:val="28"/>
     </w:rPr>
   </w:style>
@@ -1672,15 +1840,16 @@
     <w:pPr>
       <w:keepNext/>
       <w:keepLines/>
-      <w:spacing w:before="200" w:after="0"/>
+      <w:spacing w:before="240" w:after="120"/>
+      <w:outlineLvl w:val="1"/>
       <w:outlineLvl w:val="1"/>
     </w:pPr>
     <w:rPr>
       <w:rFonts w:asciiTheme="majorHAnsi" w:eastAsiaTheme="majorEastAsia" w:hAnsiTheme="majorHAnsi" w:cstheme="majorBidi" w:ascii="Arial" w:hAnsi="Arial" w:eastAsia="PingFang TC"/>
       <w:b/>
       <w:bCs/>
-      <w:color w:val="4F81BD" w:themeColor="accent1"/>
-      <w:sz w:val="26"/>
+      <w:color w:val="819B3E"/>
+      <w:sz w:val="34"/>
       <w:szCs w:val="26"/>
     </w:rPr>
   </w:style>
@@ -1696,14 +1865,16 @@
     <w:pPr>
       <w:keepNext/>
       <w:keepLines/>
-      <w:spacing w:before="200" w:after="0"/>
+      <w:spacing w:before="240" w:after="120"/>
+      <w:outlineLvl w:val="2"/>
       <w:outlineLvl w:val="2"/>
     </w:pPr>
     <w:rPr>
       <w:rFonts w:asciiTheme="majorHAnsi" w:eastAsiaTheme="majorEastAsia" w:hAnsiTheme="majorHAnsi" w:cstheme="majorBidi" w:ascii="Arial" w:hAnsi="Arial" w:eastAsia="PingFang TC"/>
       <w:b/>
       <w:bCs/>
-      <w:color w:val="4F81BD" w:themeColor="accent1"/>
+      <w:color w:val="75582E"/>
+      <w:sz w:val="28"/>
     </w:rPr>
   </w:style>
   <w:style w:type="paragraph" w:styleId="Heading4">
@@ -2121,9 +2292,6 @@
       </w:numPr>
       <w:contextualSpacing/>
     </w:pPr>
-    <w:rPr>
-      <w:rFonts w:ascii="Arial" w:hAnsi="Arial" w:eastAsia="PingFang TC"/>
-    </w:rPr>
   </w:style>
   <w:style w:type="paragraph" w:styleId="ListBullet2">
     <w:name w:val="List Bullet 2"/>
@@ -2163,9 +2331,6 @@
       </w:numPr>
       <w:contextualSpacing/>
     </w:pPr>
-    <w:rPr>
-      <w:rFonts w:ascii="Arial" w:hAnsi="Arial" w:eastAsia="PingFang TC"/>
-    </w:rPr>
   </w:style>
   <w:style w:type="paragraph" w:styleId="ListNumber2">
     <w:name w:val="List Number 2"/>

</xml_diff>